<commit_message>
Mejorar fórmulas y enlaces en el documento
</commit_message>
<xml_diff>
--- a/docs/notas_metodologicas.docx
+++ b/docs/notas_metodologicas.docx
@@ -75,6 +75,11 @@
       </w:r>
     </w:p>
     <w:p>
+      <w:r>
+        <w:br w:type="page"/>
+      </w:r>
+    </w:p>
+    <w:p>
       <w:pPr>
         <w:pStyle w:val="Heading1"/>
       </w:pPr>
@@ -91,39 +96,44 @@
       </w:r>
     </w:p>
     <w:p>
-      <m:oMath>
-        <m:r>
-          <m:t>Tasa = afectados × multiplicador / denominador</m:t>
-        </m:r>
-      </m:oMath>
+      <w:pPr>
+        <w:keepNext/>
+      </w:pPr>
+      <w:r>
+        <w:t>Tasa = afectados × multiplicador / denominador</w:t>
+      </w:r>
     </w:p>
     <w:p>
-      <m:oMath>
-        <m:r>
-          <m:t>z = 100 × valor comparable / máximo comparable</m:t>
-        </m:r>
-      </m:oMath>
+      <w:pPr>
+        <w:keepNext/>
+      </w:pPr>
+      <w:r>
+        <w:t>z = 100 × valor comparable / máximo comparable</w:t>
+      </w:r>
     </w:p>
     <w:p>
-      <m:oMath>
-        <m:r>
-          <m:t>Sector = suma de z × peso interno</m:t>
-        </m:r>
-      </m:oMath>
+      <w:pPr>
+        <w:keepNext/>
+      </w:pPr>
+      <w:r>
+        <w:t>Sector = suma de z × peso interno</w:t>
+      </w:r>
     </w:p>
     <w:p>
-      <m:oMath>
-        <m:r>
-          <m:t>D = suma de los seis sectores / 6</m:t>
-        </m:r>
-      </m:oMath>
+      <w:pPr>
+        <w:keepNext/>
+      </w:pPr>
+      <w:r>
+        <w:t>D = suma de los seis sectores / 6</w:t>
+      </w:r>
     </w:p>
     <w:p>
-      <m:oMath>
-        <m:r>
-          <m:t>P = D × (1 + 0,25 × IPM / 100) / 1,25</m:t>
-        </m:r>
-      </m:oMath>
+      <w:pPr>
+        <w:keepNext/>
+      </w:pPr>
+      <w:r>
+        <w:t>P = D × (1 + 0,25 × IPM / 100) / 1,25</w:t>
+      </w:r>
     </w:p>
     <w:p>
       <w:pPr>
@@ -775,6 +785,7 @@
     </w:p>
     <w:p>
       <w:pPr>
+        <w:keepNext/>
         <w:widowControl/>
       </w:pPr>
       <w:r>
@@ -782,12 +793,14 @@
       </w:r>
     </w:p>
     <w:p>
-      <w:pPr>
-        <w:widowControl/>
-      </w:pPr>
-      <w:r>
-        <w:t>Fuente: https://geosmart.undp.org/arcgis/apps/storymaps/stories/9d0ef01099a64edda2caecbd34135d7e</w:t>
-      </w:r>
+      <w:hyperlink r:id="rId9">
+        <w:r>
+          <w:rPr>
+            <w:color w:val="185A8D"/>
+          </w:rPr>
+          <w:t>Consultar fuente</w:t>
+        </w:r>
+      </w:hyperlink>
     </w:p>
     <w:p>
       <w:pPr>
@@ -799,6 +812,7 @@
     </w:p>
     <w:p>
       <w:pPr>
+        <w:keepNext/>
         <w:widowControl/>
       </w:pPr>
       <w:r>
@@ -806,12 +820,14 @@
       </w:r>
     </w:p>
     <w:p>
-      <w:pPr>
-        <w:widowControl/>
-      </w:pPr>
-      <w:r>
-        <w:t>Fuente: https://pnudco.github.io/Respuesta-a-crisis-y-recuperaci-n-temprana/</w:t>
-      </w:r>
+      <w:hyperlink r:id="rId10">
+        <w:r>
+          <w:rPr>
+            <w:color w:val="185A8D"/>
+          </w:rPr>
+          <w:t>Consultar fuente</w:t>
+        </w:r>
+      </w:hyperlink>
     </w:p>
     <w:p>
       <w:pPr>
@@ -823,6 +839,7 @@
     </w:p>
     <w:p>
       <w:pPr>
+        <w:keepNext/>
         <w:widowControl/>
       </w:pPr>
       <w:r>
@@ -830,12 +847,14 @@
       </w:r>
     </w:p>
     <w:p>
-      <w:pPr>
-        <w:widowControl/>
-      </w:pPr>
-      <w:r>
-        <w:t>Fuente: https://docs.google.com/spreadsheets/d/1fQ-LTlIEljzOKvW23epwevJeWLWORi88xL7XxkpTMzY</w:t>
-      </w:r>
+      <w:hyperlink r:id="rId11">
+        <w:r>
+          <w:rPr>
+            <w:color w:val="185A8D"/>
+          </w:rPr>
+          <w:t>Consultar fuente</w:t>
+        </w:r>
+      </w:hyperlink>
     </w:p>
     <w:p>
       <w:pPr>
@@ -847,6 +866,7 @@
     </w:p>
     <w:p>
       <w:pPr>
+        <w:keepNext/>
         <w:widowControl/>
       </w:pPr>
       <w:r>
@@ -854,12 +874,14 @@
       </w:r>
     </w:p>
     <w:p>
-      <w:pPr>
-        <w:widowControl/>
-      </w:pPr>
-      <w:r>
-        <w:t>Fuente: https://practicantepotencia.github.io/tablero-terremoto/data/sedes_educativas_afectadas_ago2026.csv</w:t>
-      </w:r>
+      <w:hyperlink r:id="rId12">
+        <w:r>
+          <w:rPr>
+            <w:color w:val="185A8D"/>
+          </w:rPr>
+          <w:t>Consultar fuente</w:t>
+        </w:r>
+      </w:hyperlink>
     </w:p>
     <w:p>
       <w:pPr>
@@ -871,6 +893,7 @@
     </w:p>
     <w:p>
       <w:pPr>
+        <w:keepNext/>
         <w:widowControl/>
       </w:pPr>
       <w:r>
@@ -878,12 +901,14 @@
       </w:r>
     </w:p>
     <w:p>
-      <w:pPr>
-        <w:widowControl/>
-      </w:pPr>
-      <w:r>
-        <w:t>Fuente: https://www.mapadelterremoto.com/datos/registro.json</w:t>
-      </w:r>
+      <w:hyperlink r:id="rId13">
+        <w:r>
+          <w:rPr>
+            <w:color w:val="185A8D"/>
+          </w:rPr>
+          <w:t>Consultar fuente</w:t>
+        </w:r>
+      </w:hyperlink>
     </w:p>
     <w:p>
       <w:pPr>
@@ -895,6 +920,7 @@
     </w:p>
     <w:p>
       <w:pPr>
+        <w:keepNext/>
         <w:widowControl/>
       </w:pPr>
       <w:r>
@@ -902,12 +928,14 @@
       </w:r>
     </w:p>
     <w:p>
-      <w:pPr>
-        <w:widowControl/>
-      </w:pPr>
-      <w:r>
-        <w:t>Fuente: https://practicantepotencia.github.io/tablero-terremoto/data/municipios_afectados_terremoto_colombia_ago2026.csv</w:t>
-      </w:r>
+      <w:hyperlink r:id="rId14">
+        <w:r>
+          <w:rPr>
+            <w:color w:val="185A8D"/>
+          </w:rPr>
+          <w:t>Consultar fuente</w:t>
+        </w:r>
+      </w:hyperlink>
     </w:p>
     <w:p>
       <w:pPr>
@@ -919,6 +947,7 @@
     </w:p>
     <w:p>
       <w:pPr>
+        <w:keepNext/>
         <w:widowControl/>
       </w:pPr>
       <w:r>
@@ -926,12 +955,14 @@
       </w:r>
     </w:p>
     <w:p>
-      <w:pPr>
-        <w:widowControl/>
-      </w:pPr>
-      <w:r>
-        <w:t>Fuente: https://practicantepotencia.github.io/tablero-terremoto/data/camaras_comercio_empresarios_afectados_ago2026.csv</w:t>
-      </w:r>
+      <w:hyperlink r:id="rId15">
+        <w:r>
+          <w:rPr>
+            <w:color w:val="185A8D"/>
+          </w:rPr>
+          <w:t>Consultar fuente</w:t>
+        </w:r>
+      </w:hyperlink>
     </w:p>
     <w:p>
       <w:pPr>
@@ -943,6 +974,7 @@
     </w:p>
     <w:p>
       <w:pPr>
+        <w:keepNext/>
         <w:widowControl/>
       </w:pPr>
       <w:r>
@@ -950,12 +982,14 @@
       </w:r>
     </w:p>
     <w:p>
-      <w:pPr>
-        <w:widowControl/>
-      </w:pPr>
-      <w:r>
-        <w:t>Fuente: https://practicantepotencia.github.io/tablero-terremoto/data/decreto_1171_11ago2026.pdf</w:t>
-      </w:r>
+      <w:hyperlink r:id="rId16">
+        <w:r>
+          <w:rPr>
+            <w:color w:val="185A8D"/>
+          </w:rPr>
+          <w:t>Consultar fuente</w:t>
+        </w:r>
+      </w:hyperlink>
     </w:p>
     <w:p>
       <w:pPr>
@@ -966,54 +1000,54 @@
       </w:r>
     </w:p>
     <w:p>
-      <w:pPr>
-        <w:widowControl/>
-      </w:pPr>
-      <w:r>
-        <w:t>Modelo de priorización</w:t>
-        <w:br/>
-        <w:t>https://github.com/Practicantepotencia/tablero-terremoto/blob/main/docs/modelo_priorizacion.md</w:t>
-      </w:r>
+      <w:hyperlink r:id="rId17">
+        <w:r>
+          <w:rPr>
+            <w:color w:val="185A8D"/>
+          </w:rPr>
+          <w:t>Modelo de priorización</w:t>
+        </w:r>
+      </w:hyperlink>
     </w:p>
     <w:p>
-      <w:pPr>
-        <w:widowControl/>
-      </w:pPr>
-      <w:r>
-        <w:t>Denominadores y exclusiones</w:t>
-        <w:br/>
-        <w:t>https://github.com/Practicantepotencia/tablero-terremoto/blob/main/docs/denominadores_sectoriales.md</w:t>
-      </w:r>
+      <w:hyperlink r:id="rId18">
+        <w:r>
+          <w:rPr>
+            <w:color w:val="185A8D"/>
+          </w:rPr>
+          <w:t>Denominadores y exclusiones</w:t>
+        </w:r>
+      </w:hyperlink>
     </w:p>
     <w:p>
-      <w:pPr>
-        <w:widowControl/>
-      </w:pPr>
-      <w:r>
-        <w:t>Las tres vistas y la comparación</w:t>
-        <w:br/>
-        <w:t>https://github.com/Practicantepotencia/tablero-terremoto/blob/main/docs/tablero_unificado.md</w:t>
-      </w:r>
+      <w:hyperlink r:id="rId19">
+        <w:r>
+          <w:rPr>
+            <w:color w:val="185A8D"/>
+          </w:rPr>
+          <w:t>Las tres vistas y la comparación</w:t>
+        </w:r>
+      </w:hyperlink>
     </w:p>
     <w:p>
-      <w:pPr>
-        <w:widowControl/>
-      </w:pPr>
-      <w:r>
-        <w:t>Auditoría de los indicadores</w:t>
-        <w:br/>
-        <w:t>https://github.com/Practicantepotencia/tablero-terremoto/blob/main/docs/auditoria_indicadores_largo.md</w:t>
-      </w:r>
+      <w:hyperlink r:id="rId20">
+        <w:r>
+          <w:rPr>
+            <w:color w:val="185A8D"/>
+          </w:rPr>
+          <w:t>Auditoría de los indicadores</w:t>
+        </w:r>
+      </w:hyperlink>
     </w:p>
     <w:p>
-      <w:pPr>
-        <w:widowControl/>
-      </w:pPr>
-      <w:r>
-        <w:t>Categorías comunitarias</w:t>
-        <w:br/>
-        <w:t>https://github.com/Practicantepotencia/tablero-terremoto/blob/main/docs/auditoria_comunitarios.md</w:t>
-      </w:r>
+      <w:hyperlink r:id="rId21">
+        <w:r>
+          <w:rPr>
+            <w:color w:val="185A8D"/>
+          </w:rPr>
+          <w:t>Categorías comunitarias</w:t>
+        </w:r>
+      </w:hyperlink>
     </w:p>
     <w:sectPr>
       <w:pgSz w:w="12240" w:h="15840"/>
@@ -1738,9 +1772,6 @@
     <w:qFormat/>
     <w:rsid w:val="00FC693F"/>
     <w:pPr>
-      <w:pBdr>
-        <w:bottom w:val="single" w:sz="8" w:space="4" w:color="4F81BD" w:themeColor="accent1"/>
-      </w:pBdr>
       <w:spacing w:after="140" w:line="240" w:lineRule="auto"/>
       <w:contextualSpacing/>
     </w:pPr>
@@ -2226,9 +2257,6 @@
     <w:qFormat/>
     <w:rsid w:val="00FC693F"/>
     <w:pPr>
-      <w:pBdr>
-        <w:bottom w:val="single" w:sz="4" w:space="4" w:color="4F81BD" w:themeColor="accent1"/>
-      </w:pBdr>
       <w:spacing w:before="200" w:after="280"/>
       <w:ind w:left="936" w:right="936"/>
     </w:pPr>

</xml_diff>